<commit_message>
docs: update BR/UC, demo script and test cases for lecturer feedback
</commit_message>
<xml_diff>
--- a/docs/yeu-cau/01_Use_Case_Tong_Hop.docx
+++ b/docs/yeu-cau/01_Use_Case_Tong_Hop.docx
@@ -30806,6 +30806,1774 @@
         </w:tc>
       </w:tr>
     </w:tbl>
+    <w:p>
+      <w:r>
+        <w:br w:type="page"/>
+      </w:r>
+    </w:p>
+    <w:p>
+      <w:pPr>
+        <w:pStyle w:val="Heading1"/>
+      </w:pPr>
+      <w:r>
+        <w:t xml:space="preserve">Phụ lục – Cập nhật theo góp ý giảng viên (21/10/2026)</w:t>
+      </w:r>
+    </w:p>
+    <w:p>
+      <w:r>
+        <w:t xml:space="preserve">Bổ sung cho </w:t>
+      </w:r>
+      <w:r>
+        <w:rPr>
+          <w:rFonts w:ascii="Consolas" w:hAnsi="Consolas"/>
+        </w:rPr>
+        <w:t xml:space="preserve">07_Business_Rules.docx</w:t>
+      </w:r>
+      <w:r>
+        <w:t xml:space="preserve"> và </w:t>
+      </w:r>
+      <w:r>
+        <w:rPr>
+          <w:rFonts w:ascii="Consolas" w:hAnsi="Consolas"/>
+        </w:rPr>
+        <w:t xml:space="preserve">01_Use_Case_Tong_Hop.docx</w:t>
+      </w:r>
+      <w:r>
+        <w:t xml:space="preserve"> (hai file docx đã được chèn</w:t>
+      </w:r>
+    </w:p>
+    <w:p>
+      <w:r>
+        <w:t xml:space="preserve">phụ lục cùng nội dung). Thiết kế: </w:t>
+      </w:r>
+      <w:r>
+        <w:rPr>
+          <w:rFonts w:ascii="Consolas" w:hAnsi="Consolas"/>
+        </w:rPr>
+        <w:t xml:space="preserve">ThietKe_SuaTheoGopY_GiangVien.md</w:t>
+      </w:r>
+      <w:r>
+        <w:t xml:space="preserve">. Hợp đồng API:</w:t>
+      </w:r>
+    </w:p>
+    <w:p>
+      <w:r>
+        <w:rPr>
+          <w:rFonts w:ascii="Consolas" w:hAnsi="Consolas"/>
+        </w:rPr>
+        <w:t xml:space="preserve">../huong-dan/HopDong_GopY_GD2-4.md</w:t>
+      </w:r>
+      <w:r>
+        <w:t xml:space="preserve">. Số liệu (12 giờ, 10%, 60 ngày, 7 ngày…) là giá trị mặc định,</w:t>
+      </w:r>
+    </w:p>
+    <w:p>
+      <w:r>
+        <w:t xml:space="preserve">đổi được ở Hệ thống → Cấu hình.</w:t>
+      </w:r>
+    </w:p>
+    <w:p>
+      <w:pPr>
+        <w:pStyle w:val="Heading2"/>
+      </w:pPr>
+      <w:r>
+        <w:t xml:space="preserve">1. Quy tắc đã sửa</w:t>
+      </w:r>
+    </w:p>
+    <w:tbl>
+      <w:tblPr>
+        <w:tblW w:w="5000" w:type="pct"/>
+        <w:tblBorders>
+          <w:top w:val="single" w:color="999999" w:sz="4"/>
+          <w:left w:val="single" w:color="999999" w:sz="4"/>
+          <w:bottom w:val="single" w:color="999999" w:sz="4"/>
+          <w:right w:val="single" w:color="999999" w:sz="4"/>
+          <w:insideH w:val="single" w:color="999999" w:sz="4"/>
+          <w:insideV w:val="single" w:color="999999" w:sz="4"/>
+        </w:tblBorders>
+      </w:tblPr>
+      <w:tr>
+        <w:tc>
+          <w:tcPr>
+            <w:shd w:val="clear" w:color="auto" w:fill="E8EEF7"/>
+          </w:tcPr>
+          <w:p>
+            <w:r>
+              <w:rPr>
+                <w:b/>
+                <w:bCs/>
+              </w:rPr>
+              <w:t xml:space="preserve">Mã</w:t>
+            </w:r>
+          </w:p>
+        </w:tc>
+        <w:tc>
+          <w:tcPr>
+            <w:shd w:val="clear" w:color="auto" w:fill="E8EEF7"/>
+          </w:tcPr>
+          <w:p>
+            <w:r>
+              <w:rPr>
+                <w:b/>
+                <w:bCs/>
+              </w:rPr>
+              <w:t xml:space="preserve">Trước</w:t>
+            </w:r>
+          </w:p>
+        </w:tc>
+        <w:tc>
+          <w:tcPr>
+            <w:shd w:val="clear" w:color="auto" w:fill="E8EEF7"/>
+          </w:tcPr>
+          <w:p>
+            <w:r>
+              <w:rPr>
+                <w:b/>
+                <w:bCs/>
+              </w:rPr>
+              <w:t xml:space="preserve">Sau góp ý</w:t>
+            </w:r>
+          </w:p>
+        </w:tc>
+      </w:tr>
+      <w:tr>
+        <w:tc>
+          <w:tcPr/>
+          <w:p>
+            <w:r>
+              <w:t xml:space="preserve">BR-1.3 / BR-1.4</w:t>
+            </w:r>
+          </w:p>
+        </w:tc>
+        <w:tc>
+          <w:tcPr/>
+          <w:p>
+            <w:r>
+              <w:t xml:space="preserve">Mua thêm gói thì cộng dồn ngày vào cùng một membership</w:t>
+            </w:r>
+          </w:p>
+        </w:tc>
+        <w:tc>
+          <w:tcPr/>
+          <w:p>
+            <w:r>
+              <w:rPr>
+                <w:b/>
+                <w:bCs/>
+              </w:rPr>
+              <w:t xml:space="preserve">Mỗi hóa đơn gói đã thanh toán tạo một kỳ gói riêng.</w:t>
+            </w:r>
+            <w:r>
+              <w:t xml:space="preserve"> Còn kỳ đang chạy/mua trước thì kỳ mới bắt đầu ngay sau kỳ muộn nhất; không thì bắt đầu lúc thanh toán. Chỉ một kỳ "đang hiệu lực" mỗi hội viên</w:t>
+            </w:r>
+          </w:p>
+        </w:tc>
+      </w:tr>
+      <w:tr>
+        <w:tc>
+          <w:tcPr/>
+          <w:p>
+            <w:r>
+              <w:t xml:space="preserve">BR-1.12</w:t>
+            </w:r>
+          </w:p>
+        </w:tc>
+        <w:tc>
+          <w:tcPr/>
+          <w:p>
+            <w:r>
+              <w:t xml:space="preserve">Cảnh báo gói hết hạn trước khi lớp kết thúc</w:t>
+            </w:r>
+          </w:p>
+        </w:tc>
+        <w:tc>
+          <w:tcPr/>
+          <w:p>
+            <w:r>
+              <w:t xml:space="preserve">Bỏ — học lớp không cần gói tự tập</w:t>
+            </w:r>
+          </w:p>
+        </w:tc>
+      </w:tr>
+      <w:tr>
+        <w:tc>
+          <w:tcPr/>
+          <w:p>
+            <w:r>
+              <w:t xml:space="preserve">BR-1.16</w:t>
+            </w:r>
+          </w:p>
+        </w:tc>
+        <w:tc>
+          <w:tcPr/>
+          <w:p>
+            <w:r>
+              <w:t xml:space="preserve">Bảo lưu 7–30 ngày, tối đa N lần</w:t>
+            </w:r>
+          </w:p>
+        </w:tc>
+        <w:tc>
+          <w:tcPr/>
+          <w:p>
+            <w:r>
+              <w:t xml:space="preserve">Mỗi lần ≥ </w:t>
+            </w:r>
+            <w:r>
+              <w:rPr>
+                <w:rFonts w:ascii="Consolas" w:hAnsi="Consolas"/>
+              </w:rPr>
+              <w:t xml:space="preserve">MEMBERSHIP_FREEZE_MIN_DAYS</w:t>
+            </w:r>
+            <w:r>
+              <w:t xml:space="preserve"> (7); </w:t>
+            </w:r>
+            <w:r>
+              <w:rPr>
+                <w:b/>
+                <w:bCs/>
+              </w:rPr>
+              <w:t xml:space="preserve">tổng các lần của một kỳ ≤ `MEMBERSHIP_FREEZE_MAX_TOTAL_DAYS` (60)</w:t>
+            </w:r>
+            <w:r>
+              <w:t xml:space="preserve">. Trạng thái </w:t>
+            </w:r>
+            <w:r>
+              <w:rPr>
+                <w:b/>
+                <w:bCs/>
+              </w:rPr>
+              <w:t xml:space="preserve">FROZEN</w:t>
+            </w:r>
+            <w:r>
+              <w:t xml:space="preserve"> lưu thật trong DB; không còn chặn đăng ký lớp</w:t>
+            </w:r>
+          </w:p>
+        </w:tc>
+      </w:tr>
+      <w:tr>
+        <w:tc>
+          <w:tcPr/>
+          <w:p>
+            <w:r>
+              <w:t xml:space="preserve">BR-2.1</w:t>
+            </w:r>
+          </w:p>
+        </w:tc>
+        <w:tc>
+          <w:tcPr/>
+          <w:p>
+            <w:r>
+              <w:t xml:space="preserve">Phải có gói còn hiệu lực mới đăng ký lớp</w:t>
+            </w:r>
+          </w:p>
+        </w:tc>
+        <w:tc>
+          <w:tcPr/>
+          <w:p>
+            <w:r>
+              <w:rPr>
+                <w:b/>
+                <w:bCs/>
+              </w:rPr>
+              <w:t xml:space="preserve">Lớp có học phí: phải thanh toán khóa học mới có chỗ chính thức.</w:t>
+            </w:r>
+            <w:r>
+              <w:t xml:space="preserve"> Lớp miễn phí (học phí 0) đăng ký trực tiếp</w:t>
+            </w:r>
+          </w:p>
+        </w:tc>
+      </w:tr>
+      <w:tr>
+        <w:tc>
+          <w:tcPr/>
+          <w:p>
+            <w:r>
+              <w:t xml:space="preserve">BR-2.17</w:t>
+            </w:r>
+          </w:p>
+        </w:tc>
+        <w:tc>
+          <w:tcPr/>
+          <w:p>
+            <w:r>
+              <w:t xml:space="preserve">Vắng nhiều lần bị tạm chặn đăng ký</w:t>
+            </w:r>
+          </w:p>
+        </w:tc>
+        <w:tc>
+          <w:tcPr/>
+          <w:p>
+            <w:r>
+              <w:t xml:space="preserve">Giữ nguyên; buổi </w:t>
+            </w:r>
+            <w:r>
+              <w:rPr>
+                <w:b/>
+                <w:bCs/>
+              </w:rPr>
+              <w:t xml:space="preserve">"Xin nghỉ" (EXCUSED)</w:t>
+            </w:r>
+            <w:r>
+              <w:t xml:space="preserve"> không tính là vắng và không bị ghi đè thành vắng</w:t>
+            </w:r>
+          </w:p>
+        </w:tc>
+      </w:tr>
+      <w:tr>
+        <w:tc>
+          <w:tcPr/>
+          <w:p>
+            <w:r>
+              <w:t xml:space="preserve">BR-PAY-xx</w:t>
+            </w:r>
+          </w:p>
+        </w:tc>
+        <w:tc>
+          <w:tcPr/>
+          <w:p>
+            <w:r>
+              <w:t xml:space="preserve">Áp dụng cho hóa đơn gói</w:t>
+            </w:r>
+          </w:p>
+        </w:tc>
+        <w:tc>
+          <w:tcPr/>
+          <w:p>
+            <w:r>
+              <w:t xml:space="preserve">Áp dụng y nguyên cho hóa đơn khóa học và hóa đơn chênh lệch (thiếu/thừa/lặp/sai mã/hết hạn)</w:t>
+            </w:r>
+          </w:p>
+        </w:tc>
+      </w:tr>
+    </w:tbl>
+    <w:p/>
+    <w:p>
+      <w:pPr>
+        <w:pStyle w:val="Heading2"/>
+      </w:pPr>
+      <w:r>
+        <w:t xml:space="preserve">2. Quy tắc mới</w:t>
+      </w:r>
+    </w:p>
+    <w:tbl>
+      <w:tblPr>
+        <w:tblW w:w="5000" w:type="pct"/>
+        <w:tblBorders>
+          <w:top w:val="single" w:color="999999" w:sz="4"/>
+          <w:left w:val="single" w:color="999999" w:sz="4"/>
+          <w:bottom w:val="single" w:color="999999" w:sz="4"/>
+          <w:right w:val="single" w:color="999999" w:sz="4"/>
+          <w:insideH w:val="single" w:color="999999" w:sz="4"/>
+          <w:insideV w:val="single" w:color="999999" w:sz="4"/>
+        </w:tblBorders>
+      </w:tblPr>
+      <w:tr>
+        <w:tc>
+          <w:tcPr>
+            <w:shd w:val="clear" w:color="auto" w:fill="E8EEF7"/>
+          </w:tcPr>
+          <w:p>
+            <w:r>
+              <w:rPr>
+                <w:b/>
+                <w:bCs/>
+              </w:rPr>
+              <w:t xml:space="preserve">Mã</w:t>
+            </w:r>
+          </w:p>
+        </w:tc>
+        <w:tc>
+          <w:tcPr>
+            <w:shd w:val="clear" w:color="auto" w:fill="E8EEF7"/>
+          </w:tcPr>
+          <w:p>
+            <w:r>
+              <w:rPr>
+                <w:b/>
+                <w:bCs/>
+              </w:rPr>
+              <w:t xml:space="preserve">Nội dung</w:t>
+            </w:r>
+          </w:p>
+        </w:tc>
+      </w:tr>
+      <w:tr>
+        <w:tc>
+          <w:tcPr/>
+          <w:p>
+            <w:r>
+              <w:t xml:space="preserve">BR-GY-01</w:t>
+            </w:r>
+          </w:p>
+        </w:tc>
+        <w:tc>
+          <w:tcPr/>
+          <w:p>
+            <w:r>
+              <w:t xml:space="preserve">Khung giờ hoạt động cấu hình được (mặc định Sáng sớm 05–09, Sáng 09–13, Chiều 13–17, Tối 17–22). Mỗi khung giờ học trong tuần và mỗi buổi đổi giờ phải nằm trọn trong một khung</w:t>
+            </w:r>
+          </w:p>
+        </w:tc>
+      </w:tr>
+      <w:tr>
+        <w:tc>
+          <w:tcPr/>
+          <w:p>
+            <w:r>
+              <w:t xml:space="preserve">BR-GY-02</w:t>
+            </w:r>
+          </w:p>
+        </w:tc>
+        <w:tc>
+          <w:tcPr/>
+          <w:p>
+            <w:r>
+              <w:t xml:space="preserve">Loại phòng có danh sách bộ môn dạy được và cờ "khu tự tập". Xếp lớp chỉ chọn được phòng có loại phòng dạy được bộ môn của lớp</w:t>
+            </w:r>
+          </w:p>
+        </w:tc>
+      </w:tr>
+      <w:tr>
+        <w:tc>
+          <w:tcPr/>
+          <w:p>
+            <w:r>
+              <w:t xml:space="preserve">BR-GY-03</w:t>
+            </w:r>
+          </w:p>
+        </w:tc>
+        <w:tc>
+          <w:tcPr/>
+          <w:p>
+            <w:r>
+              <w:t xml:space="preserve">HLV khai báo chuyên môn (bộ môn). Tạo/sửa lớp, đổi HLV chỉ chọn HLV có chuyên môn đúng bộ môn; không bỏ chuyên môn khi HLV còn dạy lớp bộ môn đó</w:t>
+            </w:r>
+          </w:p>
+        </w:tc>
+      </w:tr>
+      <w:tr>
+        <w:tc>
+          <w:tcPr/>
+          <w:p>
+            <w:r>
+              <w:t xml:space="preserve">BR-GY-04</w:t>
+            </w:r>
+          </w:p>
+        </w:tc>
+        <w:tc>
+          <w:tcPr/>
+          <w:p>
+            <w:r>
+              <w:t xml:space="preserve">Sửa lớp / đổi giờ buổi: xem trước số buổi đổi, học viên đang học và ai bị trùng lịch; quản lý xác nhận mới lưu</w:t>
+            </w:r>
+          </w:p>
+        </w:tc>
+      </w:tr>
+      <w:tr>
+        <w:tc>
+          <w:tcPr/>
+          <w:p>
+            <w:r>
+              <w:t xml:space="preserve">BR-GY-05</w:t>
+            </w:r>
+          </w:p>
+        </w:tc>
+        <w:tc>
+          <w:tcPr/>
+          <w:p>
+            <w:r>
+              <w:rPr>
+                <w:b/>
+                <w:bCs/>
+              </w:rPr>
+              <w:t xml:space="preserve">Gói tự tập</w:t>
+            </w:r>
+            <w:r>
+              <w:t xml:space="preserve"> = thời hạn + khung giờ được vào + khu tự tập được vào. Không chọn khung giờ = mọi khung; không chọn khu vực = mọi khu tự tập</w:t>
+            </w:r>
+          </w:p>
+        </w:tc>
+      </w:tr>
+      <w:tr>
+        <w:tc>
+          <w:tcPr/>
+          <w:p>
+            <w:r>
+              <w:t xml:space="preserve">BR-GY-06</w:t>
+            </w:r>
+          </w:p>
+        </w:tc>
+        <w:tc>
+          <w:tcPr/>
+          <w:p>
+            <w:r>
+              <w:t xml:space="preserve">Check-in từ chối khi kỳ gói đang bảo lưu, giờ hiện tại ngoài khung của gói ("Ngoài khung giờ của gói …") hoặc khu vực lễ tân chọn không thuộc gói ("Gói không cho vào khu vực …")</w:t>
+            </w:r>
+          </w:p>
+        </w:tc>
+      </w:tr>
+      <w:tr>
+        <w:tc>
+          <w:tcPr/>
+          <w:p>
+            <w:r>
+              <w:t xml:space="preserve">BR-GY-07</w:t>
+            </w:r>
+          </w:p>
+        </w:tc>
+        <w:tc>
+          <w:tcPr/>
+          <w:p>
+            <w:r>
+              <w:rPr>
+                <w:b/>
+                <w:bCs/>
+              </w:rPr>
+              <w:t xml:space="preserve">Khóa học</w:t>
+            </w:r>
+            <w:r>
+              <w:t xml:space="preserve">: lớp có học phí cả khóa. Đăng ký giữa khóa trả </w:t>
+            </w:r>
+            <w:r>
+              <w:rPr>
+                <w:rFonts w:ascii="Consolas" w:hAnsi="Consolas"/>
+              </w:rPr>
+              <w:t xml:space="preserve">làm tròn nghìn(học phí × buổi còn lại / tổng buổi)</w:t>
+            </w:r>
+          </w:p>
+        </w:tc>
+      </w:tr>
+      <w:tr>
+        <w:tc>
+          <w:tcPr/>
+          <w:p>
+            <w:r>
+              <w:t xml:space="preserve">BR-GY-08</w:t>
+            </w:r>
+          </w:p>
+        </w:tc>
+        <w:tc>
+          <w:tcPr/>
+          <w:p>
+            <w:r>
+              <w:t xml:space="preserve">Mua khóa học tạo hóa đơn khóa học và </w:t>
+            </w:r>
+            <w:r>
+              <w:rPr>
+                <w:b/>
+                <w:bCs/>
+              </w:rPr>
+              <w:t xml:space="preserve">giữ chỗ (PENDING_PAYMENT)</w:t>
+            </w:r>
+            <w:r>
+              <w:t xml:space="preserve"> tới hạn thanh toán; chỗ giữ tính vào sức chứa. Thanh toán đủ → đăng ký chính thức. Hết hạn / bỏ giữ chỗ → hủy hóa đơn chưa nhận tiền, nhả chỗ, mời người chờ</w:t>
+            </w:r>
+          </w:p>
+        </w:tc>
+      </w:tr>
+      <w:tr>
+        <w:tc>
+          <w:tcPr/>
+          <w:p>
+            <w:r>
+              <w:t xml:space="preserve">BR-GY-09</w:t>
+            </w:r>
+          </w:p>
+        </w:tc>
+        <w:tc>
+          <w:tcPr/>
+          <w:p>
+            <w:r>
+              <w:rPr>
+                <w:b/>
+                <w:bCs/>
+              </w:rPr>
+              <w:t xml:space="preserve">Báo nghỉ một buổi</w:t>
+            </w:r>
+            <w:r>
+              <w:t xml:space="preserve"> trước giờ học ít nhất </w:t>
+            </w:r>
+            <w:r>
+              <w:rPr>
+                <w:rFonts w:ascii="Consolas" w:hAnsi="Consolas"/>
+              </w:rPr>
+              <w:t xml:space="preserve">CLASS_CANCEL_MIN_HOURS_BEFORE</w:t>
+            </w:r>
+            <w:r>
+              <w:t xml:space="preserve"> (12) giờ: buổi ghi "Xin nghỉ", không hoàn tiền, không hủy đăng ký cả khóa</w:t>
+            </w:r>
+          </w:p>
+        </w:tc>
+      </w:tr>
+      <w:tr>
+        <w:tc>
+          <w:tcPr/>
+          <w:p>
+            <w:r>
+              <w:t xml:space="preserve">BR-GY-10</w:t>
+            </w:r>
+          </w:p>
+        </w:tc>
+        <w:tc>
+          <w:tcPr/>
+          <w:p>
+            <w:r>
+              <w:rPr>
+                <w:b/>
+                <w:bCs/>
+              </w:rPr>
+              <w:t xml:space="preserve">Hủy kỳ gói</w:t>
+            </w:r>
+            <w:r>
+              <w:t xml:space="preserve"> (đang hoạt động, không bảo lưu) hoặc </w:t>
+            </w:r>
+            <w:r>
+              <w:rPr>
+                <w:b/>
+                <w:bCs/>
+              </w:rPr>
+              <w:t xml:space="preserve">hủy khóa học</w:t>
+            </w:r>
+            <w:r>
+              <w:t xml:space="preserve"> (đã thanh toán, còn buổi): giá trị còn lại = đã trả × ngày chưa dùng / tổng ngày (gói) hoặc × buổi chưa diễn ra / số buổi đã mua (khóa); </w:t>
+            </w:r>
+            <w:r>
+              <w:rPr>
+                <w:b/>
+                <w:bCs/>
+              </w:rPr>
+              <w:t xml:space="preserve">phí hủy</w:t>
+            </w:r>
+            <w:r>
+              <w:t xml:space="preserve"> = </w:t>
+            </w:r>
+            <w:r>
+              <w:rPr>
+                <w:rFonts w:ascii="Consolas" w:hAnsi="Consolas"/>
+              </w:rPr>
+              <w:t xml:space="preserve">CANCELLATION_FEE_PERCENT</w:t>
+            </w:r>
+            <w:r>
+              <w:t xml:space="preserve"> (10%) giá trị còn lại; </w:t>
+            </w:r>
+            <w:r>
+              <w:rPr>
+                <w:b/>
+                <w:bCs/>
+              </w:rPr>
+              <w:t xml:space="preserve">hủy trước ngày bắt đầu: hoàn 100%, không phí</w:t>
+            </w:r>
+          </w:p>
+        </w:tc>
+      </w:tr>
+      <w:tr>
+        <w:tc>
+          <w:tcPr/>
+          <w:p>
+            <w:r>
+              <w:t xml:space="preserve">BR-GY-11</w:t>
+            </w:r>
+          </w:p>
+        </w:tc>
+        <w:tc>
+          <w:tcPr/>
+          <w:p>
+            <w:r>
+              <w:t xml:space="preserve">Hội viên chọn </w:t>
+            </w:r>
+            <w:r>
+              <w:rPr>
+                <w:b/>
+                <w:bCs/>
+              </w:rPr>
+              <w:t xml:space="preserve">nhận tiền hoàn</w:t>
+            </w:r>
+            <w:r>
+              <w:t xml:space="preserve"> (tạo yêu cầu hoàn, quản lý chuyển trả và nhập mã tham chiếu) hoặc </w:t>
+            </w:r>
+            <w:r>
+              <w:rPr>
+                <w:b/>
+                <w:bCs/>
+              </w:rPr>
+              <w:t xml:space="preserve">ghi số dư</w:t>
+            </w:r>
+            <w:r>
+              <w:t xml:space="preserve"> (cộng ngay). Hóa đơn gốc giữ "Đã thanh toán"; báo cáo trừ đúng phần đã hoàn</w:t>
+            </w:r>
+          </w:p>
+        </w:tc>
+      </w:tr>
+      <w:tr>
+        <w:tc>
+          <w:tcPr/>
+          <w:p>
+            <w:r>
+              <w:t xml:space="preserve">BR-GY-12</w:t>
+            </w:r>
+          </w:p>
+        </w:tc>
+        <w:tc>
+          <w:tcPr/>
+          <w:p>
+            <w:r>
+              <w:rPr>
+                <w:b/>
+                <w:bCs/>
+              </w:rPr>
+              <w:t xml:space="preserve">Số dư tài khoản</w:t>
+            </w:r>
+            <w:r>
+              <w:t xml:space="preserve">: sổ chỉ thêm (+ hủy/đổi/bù, − thanh toán), số dư không âm. Dùng số dư trừ trước vào hóa đơn đang chờ; phần còn lại trả QR / tiền mặt. Hóa đơn hết hạn thì phần số dư đã trừ được trả lại số dư</w:t>
+            </w:r>
+          </w:p>
+        </w:tc>
+      </w:tr>
+      <w:tr>
+        <w:tc>
+          <w:tcPr/>
+          <w:p>
+            <w:r>
+              <w:t xml:space="preserve">BR-GY-13</w:t>
+            </w:r>
+          </w:p>
+        </w:tc>
+        <w:tc>
+          <w:tcPr/>
+          <w:p>
+            <w:r>
+              <w:t xml:space="preserve">Doanh thu không tính lại phần trả bằng số dư (đã là doanh thu của lần mua trước)</w:t>
+            </w:r>
+          </w:p>
+        </w:tc>
+      </w:tr>
+      <w:tr>
+        <w:tc>
+          <w:tcPr/>
+          <w:p>
+            <w:r>
+              <w:t xml:space="preserve">BR-GY-14</w:t>
+            </w:r>
+          </w:p>
+        </w:tc>
+        <w:tc>
+          <w:tcPr/>
+          <w:p>
+            <w:r>
+              <w:rPr>
+                <w:b/>
+                <w:bCs/>
+              </w:rPr>
+              <w:t xml:space="preserve">Đổi gói / đổi lớp sau thanh toán</w:t>
+            </w:r>
+            <w:r>
+              <w:t xml:space="preserve">: chênh lệch = giá mới − giá trị còn lại (không phí). &gt; 0 → hóa đơn chênh lệch, thu đủ mới chuyển sang sản phẩm mới (lớp mới được giữ chỗ trong lúc chờ); ≤ 0 → chuyển ngay, phần dư hoàn hoặc ghi số dư. Đang có yêu cầu đổi chờ thanh toán thì chưa hủy/đổi tiếp</w:t>
+            </w:r>
+          </w:p>
+        </w:tc>
+      </w:tr>
+      <w:tr>
+        <w:tc>
+          <w:tcPr/>
+          <w:p>
+            <w:r>
+              <w:t xml:space="preserve">BR-GY-15</w:t>
+            </w:r>
+          </w:p>
+        </w:tc>
+        <w:tc>
+          <w:tcPr/>
+          <w:p>
+            <w:r>
+              <w:t xml:space="preserve">Sau thanh toán </w:t>
+            </w:r>
+            <w:r>
+              <w:rPr>
+                <w:b/>
+                <w:bCs/>
+              </w:rPr>
+              <w:t xml:space="preserve">không sửa</w:t>
+            </w:r>
+            <w:r>
+              <w:t xml:space="preserve"> giá, gói, ngày hiệu lực trên hóa đơn; chỉ thay đổi qua hủy / đổi / bảo lưu. Mọi lần hủy/đổi lưu lịch sử (từ → sang, giá trị còn lại, phí, chênh lệch, hóa đơn/khoản hoàn/số dư liên quan, người thực hiện)</w:t>
+            </w:r>
+          </w:p>
+        </w:tc>
+      </w:tr>
+      <w:tr>
+        <w:tc>
+          <w:tcPr/>
+          <w:p>
+            <w:r>
+              <w:t xml:space="preserve">BR-GY-16</w:t>
+            </w:r>
+          </w:p>
+        </w:tc>
+        <w:tc>
+          <w:tcPr/>
+          <w:p>
+            <w:r>
+              <w:t xml:space="preserve">Bảo lưu: tới ngày bắt đầu kỳ chuyển FROZEN (không check-in); hết hạn bảo lưu </w:t>
+            </w:r>
+            <w:r>
+              <w:rPr>
+                <w:b/>
+                <w:bCs/>
+              </w:rPr>
+              <w:t xml:space="preserve">hệ thống tự mở lại</w:t>
+            </w:r>
+            <w:r>
+              <w:t xml:space="preserve">, cộng bù đúng số ngày đã dừng, dời các kỳ mua nối tiếp và báo hội viên. Kết thúc sớm chỉ cộng ngày thực dừng</w:t>
+            </w:r>
+          </w:p>
+        </w:tc>
+      </w:tr>
+      <w:tr>
+        <w:tc>
+          <w:tcPr/>
+          <w:p>
+            <w:r>
+              <w:t xml:space="preserve">BR-GY-17</w:t>
+            </w:r>
+          </w:p>
+        </w:tc>
+        <w:tc>
+          <w:tcPr/>
+          <w:p>
+            <w:r>
+              <w:rPr>
+                <w:b/>
+                <w:bCs/>
+              </w:rPr>
+              <w:t xml:space="preserve">Trung tâm hủy cả lớp</w:t>
+            </w:r>
+            <w:r>
+              <w:t xml:space="preserve">: học viên đã thanh toán được ghi số dư toàn bộ phần chưa học (không phí). </w:t>
+            </w:r>
+            <w:r>
+              <w:rPr>
+                <w:b/>
+                <w:bCs/>
+              </w:rPr>
+              <w:t xml:space="preserve">Trung tâm hủy một buổi</w:t>
+            </w:r>
+            <w:r>
+              <w:t xml:space="preserve">: ghi số dư giá trị một buổi</w:t>
+            </w:r>
+          </w:p>
+        </w:tc>
+      </w:tr>
+    </w:tbl>
+    <w:p/>
+    <w:p>
+      <w:pPr>
+        <w:pStyle w:val="Heading2"/>
+      </w:pPr>
+      <w:r>
+        <w:t xml:space="preserve">3. Use case mới / sửa</w:t>
+      </w:r>
+    </w:p>
+    <w:tbl>
+      <w:tblPr>
+        <w:tblW w:w="5000" w:type="pct"/>
+        <w:tblBorders>
+          <w:top w:val="single" w:color="999999" w:sz="4"/>
+          <w:left w:val="single" w:color="999999" w:sz="4"/>
+          <w:bottom w:val="single" w:color="999999" w:sz="4"/>
+          <w:right w:val="single" w:color="999999" w:sz="4"/>
+          <w:insideH w:val="single" w:color="999999" w:sz="4"/>
+          <w:insideV w:val="single" w:color="999999" w:sz="4"/>
+        </w:tblBorders>
+      </w:tblPr>
+      <w:tr>
+        <w:tc>
+          <w:tcPr>
+            <w:shd w:val="clear" w:color="auto" w:fill="E8EEF7"/>
+          </w:tcPr>
+          <w:p>
+            <w:r>
+              <w:rPr>
+                <w:b/>
+                <w:bCs/>
+              </w:rPr>
+              <w:t xml:space="preserve">Mã</w:t>
+            </w:r>
+          </w:p>
+        </w:tc>
+        <w:tc>
+          <w:tcPr>
+            <w:shd w:val="clear" w:color="auto" w:fill="E8EEF7"/>
+          </w:tcPr>
+          <w:p>
+            <w:r>
+              <w:rPr>
+                <w:b/>
+                <w:bCs/>
+              </w:rPr>
+              <w:t xml:space="preserve">Tên</w:t>
+            </w:r>
+          </w:p>
+        </w:tc>
+        <w:tc>
+          <w:tcPr>
+            <w:shd w:val="clear" w:color="auto" w:fill="E8EEF7"/>
+          </w:tcPr>
+          <w:p>
+            <w:r>
+              <w:rPr>
+                <w:b/>
+                <w:bCs/>
+              </w:rPr>
+              <w:t xml:space="preserve">Tác nhân</w:t>
+            </w:r>
+          </w:p>
+        </w:tc>
+        <w:tc>
+          <w:tcPr>
+            <w:shd w:val="clear" w:color="auto" w:fill="E8EEF7"/>
+          </w:tcPr>
+          <w:p>
+            <w:r>
+              <w:rPr>
+                <w:b/>
+                <w:bCs/>
+              </w:rPr>
+              <w:t xml:space="preserve">Luồng chính</w:t>
+            </w:r>
+          </w:p>
+        </w:tc>
+        <w:tc>
+          <w:tcPr>
+            <w:shd w:val="clear" w:color="auto" w:fill="E8EEF7"/>
+          </w:tcPr>
+          <w:p>
+            <w:r>
+              <w:rPr>
+                <w:b/>
+                <w:bCs/>
+              </w:rPr>
+              <w:t xml:space="preserve">BR</w:t>
+            </w:r>
+          </w:p>
+        </w:tc>
+      </w:tr>
+      <w:tr>
+        <w:tc>
+          <w:tcPr/>
+          <w:p>
+            <w:r>
+              <w:t xml:space="preserve">UC-CB-21</w:t>
+            </w:r>
+          </w:p>
+        </w:tc>
+        <w:tc>
+          <w:tcPr/>
+          <w:p>
+            <w:r>
+              <w:t xml:space="preserve">Cấu hình khung giờ hoạt động</w:t>
+            </w:r>
+          </w:p>
+        </w:tc>
+        <w:tc>
+          <w:tcPr/>
+          <w:p>
+            <w:r>
+              <w:t xml:space="preserve">Quản lý</w:t>
+            </w:r>
+          </w:p>
+        </w:tc>
+        <w:tc>
+          <w:tcPr/>
+          <w:p>
+            <w:r>
+              <w:t xml:space="preserve">Lịch tập → Tài nguyên → Khung giờ: thêm/sửa/ngừng khung; không trùng khung đang hoạt động</w:t>
+            </w:r>
+          </w:p>
+        </w:tc>
+        <w:tc>
+          <w:tcPr/>
+          <w:p>
+            <w:r>
+              <w:t xml:space="preserve">GY-01</w:t>
+            </w:r>
+          </w:p>
+        </w:tc>
+      </w:tr>
+      <w:tr>
+        <w:tc>
+          <w:tcPr/>
+          <w:p>
+            <w:r>
+              <w:t xml:space="preserve">UC-CB-22</w:t>
+            </w:r>
+          </w:p>
+        </w:tc>
+        <w:tc>
+          <w:tcPr/>
+          <w:p>
+            <w:r>
+              <w:t xml:space="preserve">Cấu hình loại phòng</w:t>
+            </w:r>
+          </w:p>
+        </w:tc>
+        <w:tc>
+          <w:tcPr/>
+          <w:p>
+            <w:r>
+              <w:t xml:space="preserve">Quản lý</w:t>
+            </w:r>
+          </w:p>
+        </w:tc>
+        <w:tc>
+          <w:tcPr/>
+          <w:p>
+            <w:r>
+              <w:t xml:space="preserve">Tài nguyên → Loại phòng: tên, chức năng, bộ môn dạy được, khu tự tập</w:t>
+            </w:r>
+          </w:p>
+        </w:tc>
+        <w:tc>
+          <w:tcPr/>
+          <w:p>
+            <w:r>
+              <w:t xml:space="preserve">GY-02</w:t>
+            </w:r>
+          </w:p>
+        </w:tc>
+      </w:tr>
+      <w:tr>
+        <w:tc>
+          <w:tcPr/>
+          <w:p>
+            <w:r>
+              <w:t xml:space="preserve">UC-UM-21</w:t>
+            </w:r>
+          </w:p>
+        </w:tc>
+        <w:tc>
+          <w:tcPr/>
+          <w:p>
+            <w:r>
+              <w:t xml:space="preserve">Khai báo chuyên môn HLV</w:t>
+            </w:r>
+          </w:p>
+        </w:tc>
+        <w:tc>
+          <w:tcPr/>
+          <w:p>
+            <w:r>
+              <w:t xml:space="preserve">Quản lý</w:t>
+            </w:r>
+          </w:p>
+        </w:tc>
+        <w:tc>
+          <w:tcPr/>
+          <w:p>
+            <w:r>
+              <w:t xml:space="preserve">Hệ thống → Tài khoản → cột Chuyên môn → Sửa</w:t>
+            </w:r>
+          </w:p>
+        </w:tc>
+        <w:tc>
+          <w:tcPr/>
+          <w:p>
+            <w:r>
+              <w:t xml:space="preserve">GY-03</w:t>
+            </w:r>
+          </w:p>
+        </w:tc>
+      </w:tr>
+      <w:tr>
+        <w:tc>
+          <w:tcPr/>
+          <w:p>
+            <w:r>
+              <w:t xml:space="preserve">UC-CB-03 (sửa)</w:t>
+            </w:r>
+          </w:p>
+        </w:tc>
+        <w:tc>
+          <w:tcPr/>
+          <w:p>
+            <w:r>
+              <w:t xml:space="preserve">Cập nhật lịch lớp có xem trước</w:t>
+            </w:r>
+          </w:p>
+        </w:tc>
+        <w:tc>
+          <w:tcPr/>
+          <w:p>
+            <w:r>
+              <w:t xml:space="preserve">Quản lý</w:t>
+            </w:r>
+          </w:p>
+        </w:tc>
+        <w:tc>
+          <w:tcPr/>
+          <w:p>
+            <w:r>
+              <w:t xml:space="preserve">Sửa lớp / đổi giờ buổi → hệ thống hiện số buổi đổi, học viên bị ảnh hưởng → Xác nhận</w:t>
+            </w:r>
+          </w:p>
+        </w:tc>
+        <w:tc>
+          <w:tcPr/>
+          <w:p>
+            <w:r>
+              <w:t xml:space="preserve">GY-04</w:t>
+            </w:r>
+          </w:p>
+        </w:tc>
+      </w:tr>
+      <w:tr>
+        <w:tc>
+          <w:tcPr/>
+          <w:p>
+            <w:r>
+              <w:t xml:space="preserve">UC-UM-03 (sửa)</w:t>
+            </w:r>
+          </w:p>
+        </w:tc>
+        <w:tc>
+          <w:tcPr/>
+          <w:p>
+            <w:r>
+              <w:t xml:space="preserve">Xem gói tự tập và kỳ gói</w:t>
+            </w:r>
+          </w:p>
+        </w:tc>
+        <w:tc>
+          <w:tcPr/>
+          <w:p>
+            <w:r>
+              <w:t xml:space="preserve">Hội viên</w:t>
+            </w:r>
+          </w:p>
+        </w:tc>
+        <w:tc>
+          <w:tcPr/>
+          <w:p>
+            <w:r>
+              <w:t xml:space="preserve">Gói tập: thẻ gói hiện khung giờ/khu vực; thẻ "Gói của bạn" hiện kỳ đang dùng + kỳ mua nối tiếp</w:t>
+            </w:r>
+          </w:p>
+        </w:tc>
+        <w:tc>
+          <w:tcPr/>
+          <w:p>
+            <w:r>
+              <w:t xml:space="preserve">GY-05, 1.3</w:t>
+            </w:r>
+          </w:p>
+        </w:tc>
+      </w:tr>
+      <w:tr>
+        <w:tc>
+          <w:tcPr/>
+          <w:p>
+            <w:r>
+              <w:t xml:space="preserve">UC-UM-08 (sửa)</w:t>
+            </w:r>
+          </w:p>
+        </w:tc>
+        <w:tc>
+          <w:tcPr/>
+          <w:p>
+            <w:r>
+              <w:t xml:space="preserve">Quản lý gói tự tập</w:t>
+            </w:r>
+          </w:p>
+        </w:tc>
+        <w:tc>
+          <w:tcPr/>
+          <w:p>
+            <w:r>
+              <w:t xml:space="preserve">Quản lý</w:t>
+            </w:r>
+          </w:p>
+        </w:tc>
+        <w:tc>
+          <w:tcPr/>
+          <w:p>
+            <w:r>
+              <w:t xml:space="preserve">Tạo/sửa gói: giá, thời hạn, khung giờ, khu tự tập</w:t>
+            </w:r>
+          </w:p>
+        </w:tc>
+        <w:tc>
+          <w:tcPr/>
+          <w:p>
+            <w:r>
+              <w:t xml:space="preserve">GY-05</w:t>
+            </w:r>
+          </w:p>
+        </w:tc>
+      </w:tr>
+      <w:tr>
+        <w:tc>
+          <w:tcPr/>
+          <w:p>
+            <w:r>
+              <w:t xml:space="preserve">UC-AT-01 (sửa)</w:t>
+            </w:r>
+          </w:p>
+        </w:tc>
+        <w:tc>
+          <w:tcPr/>
+          <w:p>
+            <w:r>
+              <w:t xml:space="preserve">Check-in tại quầy</w:t>
+            </w:r>
+          </w:p>
+        </w:tc>
+        <w:tc>
+          <w:tcPr/>
+          <w:p>
+            <w:r>
+              <w:t xml:space="preserve">Lễ tân</w:t>
+            </w:r>
+          </w:p>
+        </w:tc>
+        <w:tc>
+          <w:tcPr/>
+          <w:p>
+            <w:r>
+              <w:t xml:space="preserve">Chọn hội viên, (tuỳ chọn) khu vực → hệ thống kiểm tra kỳ gói, bảo lưu, khung giờ, khu vực</w:t>
+            </w:r>
+          </w:p>
+        </w:tc>
+        <w:tc>
+          <w:tcPr/>
+          <w:p>
+            <w:r>
+              <w:t xml:space="preserve">GY-06</w:t>
+            </w:r>
+          </w:p>
+        </w:tc>
+      </w:tr>
+      <w:tr>
+        <w:tc>
+          <w:tcPr/>
+          <w:p>
+            <w:r>
+              <w:t xml:space="preserve">UC-CB-06 (sửa)</w:t>
+            </w:r>
+          </w:p>
+        </w:tc>
+        <w:tc>
+          <w:tcPr/>
+          <w:p>
+            <w:r>
+              <w:t xml:space="preserve">Đăng ký lớp = mua khóa học</w:t>
+            </w:r>
+          </w:p>
+        </w:tc>
+        <w:tc>
+          <w:tcPr/>
+          <w:p>
+            <w:r>
+              <w:t xml:space="preserve">Hội viên / Lễ tân</w:t>
+            </w:r>
+          </w:p>
+        </w:tc>
+        <w:tc>
+          <w:tcPr/>
+          <w:p>
+            <w:r>
+              <w:t xml:space="preserve">Lịch tập → lớp có học phí → Đăng ký khóa học → hóa đơn (QR online hoặc tại quầy), giữ chỗ → thanh toán → chính thức</w:t>
+            </w:r>
+          </w:p>
+        </w:tc>
+        <w:tc>
+          <w:tcPr/>
+          <w:p>
+            <w:r>
+              <w:t xml:space="preserve">GY-07, GY-08</w:t>
+            </w:r>
+          </w:p>
+        </w:tc>
+      </w:tr>
+      <w:tr>
+        <w:tc>
+          <w:tcPr/>
+          <w:p>
+            <w:r>
+              <w:t xml:space="preserve">UC-CB-23</w:t>
+            </w:r>
+          </w:p>
+        </w:tc>
+        <w:tc>
+          <w:tcPr/>
+          <w:p>
+            <w:r>
+              <w:t xml:space="preserve">Báo nghỉ một buổi</w:t>
+            </w:r>
+          </w:p>
+        </w:tc>
+        <w:tc>
+          <w:tcPr/>
+          <w:p>
+            <w:r>
+              <w:t xml:space="preserve">Hội viên / Lễ tân</w:t>
+            </w:r>
+          </w:p>
+        </w:tc>
+        <w:tc>
+          <w:tcPr/>
+          <w:p>
+            <w:r>
+              <w:t xml:space="preserve">Lịch của tôi → buổi → Báo nghỉ → xác nhận</w:t>
+            </w:r>
+          </w:p>
+        </w:tc>
+        <w:tc>
+          <w:tcPr/>
+          <w:p>
+            <w:r>
+              <w:t xml:space="preserve">GY-09</w:t>
+            </w:r>
+          </w:p>
+        </w:tc>
+      </w:tr>
+      <w:tr>
+        <w:tc>
+          <w:tcPr/>
+          <w:p>
+            <w:r>
+              <w:t xml:space="preserve">UC-PAY-20</w:t>
+            </w:r>
+          </w:p>
+        </w:tc>
+        <w:tc>
+          <w:tcPr/>
+          <w:p>
+            <w:r>
+              <w:t xml:space="preserve">Hủy kỳ gói / hủy khóa học</w:t>
+            </w:r>
+          </w:p>
+        </w:tc>
+        <w:tc>
+          <w:tcPr/>
+          <w:p>
+            <w:r>
+              <w:t xml:space="preserve">Hội viên / Lễ tân</w:t>
+            </w:r>
+          </w:p>
+        </w:tc>
+        <w:tc>
+          <w:tcPr/>
+          <w:p>
+            <w:r>
+              <w:t xml:space="preserve">Xem trước (đã trả, còn lại, phí, được hoàn) → chọn Hoàn tiền / Ghi số dư → xác nhận</w:t>
+            </w:r>
+          </w:p>
+        </w:tc>
+        <w:tc>
+          <w:tcPr/>
+          <w:p>
+            <w:r>
+              <w:t xml:space="preserve">GY-10, GY-11</w:t>
+            </w:r>
+          </w:p>
+        </w:tc>
+      </w:tr>
+      <w:tr>
+        <w:tc>
+          <w:tcPr/>
+          <w:p>
+            <w:r>
+              <w:t xml:space="preserve">UC-PAY-21</w:t>
+            </w:r>
+          </w:p>
+        </w:tc>
+        <w:tc>
+          <w:tcPr/>
+          <w:p>
+            <w:r>
+              <w:t xml:space="preserve">Xem và dùng số dư</w:t>
+            </w:r>
+          </w:p>
+        </w:tc>
+        <w:tc>
+          <w:tcPr/>
+          <w:p>
+            <w:r>
+              <w:t xml:space="preserve">Hội viên / Lễ tân</w:t>
+            </w:r>
+          </w:p>
+        </w:tc>
+        <w:tc>
+          <w:tcPr/>
+          <w:p>
+            <w:r>
+              <w:t xml:space="preserve">Hồ sơ → Số dư; hóa đơn chờ thanh toán → Dùng số dư</w:t>
+            </w:r>
+          </w:p>
+        </w:tc>
+        <w:tc>
+          <w:tcPr/>
+          <w:p>
+            <w:r>
+              <w:t xml:space="preserve">GY-12, GY-13</w:t>
+            </w:r>
+          </w:p>
+        </w:tc>
+      </w:tr>
+      <w:tr>
+        <w:tc>
+          <w:tcPr/>
+          <w:p>
+            <w:r>
+              <w:t xml:space="preserve">UC-PAY-22</w:t>
+            </w:r>
+          </w:p>
+        </w:tc>
+        <w:tc>
+          <w:tcPr/>
+          <w:p>
+            <w:r>
+              <w:t xml:space="preserve">Đổi gói / đổi lớp</w:t>
+            </w:r>
+          </w:p>
+        </w:tc>
+        <w:tc>
+          <w:tcPr/>
+          <w:p>
+            <w:r>
+              <w:t xml:space="preserve">Hội viên / Lễ tân</w:t>
+            </w:r>
+          </w:p>
+        </w:tc>
+        <w:tc>
+          <w:tcPr/>
+          <w:p>
+            <w:r>
+              <w:t xml:space="preserve">Chọn gói/lớp đích → xem chênh lệch → thu thêm (hóa đơn chênh lệch) hoặc nhận phần dư</w:t>
+            </w:r>
+          </w:p>
+        </w:tc>
+        <w:tc>
+          <w:tcPr/>
+          <w:p>
+            <w:r>
+              <w:t xml:space="preserve">GY-14, GY-15</w:t>
+            </w:r>
+          </w:p>
+        </w:tc>
+      </w:tr>
+      <w:tr>
+        <w:tc>
+          <w:tcPr/>
+          <w:p>
+            <w:r>
+              <w:t xml:space="preserve">UC-UM-20 (sửa)</w:t>
+            </w:r>
+          </w:p>
+        </w:tc>
+        <w:tc>
+          <w:tcPr/>
+          <w:p>
+            <w:r>
+              <w:t xml:space="preserve">Bảo lưu gói</w:t>
+            </w:r>
+          </w:p>
+        </w:tc>
+        <w:tc>
+          <w:tcPr/>
+          <w:p>
+            <w:r>
+              <w:t xml:space="preserve">Hội viên / Lễ tân</w:t>
+            </w:r>
+          </w:p>
+        </w:tc>
+        <w:tc>
+          <w:tcPr/>
+          <w:p>
+            <w:r>
+              <w:t xml:space="preserve">Chọn khoảng ngày (≥ 7, ≤ ngày còn lại của ngân sách 60) → kỳ FROZEN khi tới ngày → tự mở lại / kết thúc sớm</w:t>
+            </w:r>
+          </w:p>
+        </w:tc>
+        <w:tc>
+          <w:tcPr/>
+          <w:p>
+            <w:r>
+              <w:t xml:space="preserve">1.16, GY-16</w:t>
+            </w:r>
+          </w:p>
+        </w:tc>
+      </w:tr>
+      <w:tr>
+        <w:tc>
+          <w:tcPr/>
+          <w:p>
+            <w:r>
+              <w:t xml:space="preserve">UC-CB-04 (sửa)</w:t>
+            </w:r>
+          </w:p>
+        </w:tc>
+        <w:tc>
+          <w:tcPr/>
+          <w:p>
+            <w:r>
+              <w:t xml:space="preserve">Trung tâm hủy lớp / buổi</w:t>
+            </w:r>
+          </w:p>
+        </w:tc>
+        <w:tc>
+          <w:tcPr/>
+          <w:p>
+            <w:r>
+              <w:t xml:space="preserve">Quản lý</w:t>
+            </w:r>
+          </w:p>
+        </w:tc>
+        <w:tc>
+          <w:tcPr/>
+          <w:p>
+            <w:r>
+              <w:t xml:space="preserve">Hủy lớp hoặc buổi → hệ thống thông báo và bù số dư cho học viên đã thanh toán</w:t>
+            </w:r>
+          </w:p>
+        </w:tc>
+        <w:tc>
+          <w:tcPr/>
+          <w:p>
+            <w:r>
+              <w:t xml:space="preserve">GY-17</w:t>
+            </w:r>
+          </w:p>
+        </w:tc>
+      </w:tr>
+    </w:tbl>
+    <w:p/>
+    <w:p>
+      <w:pPr>
+        <w:pStyle w:val="Heading2"/>
+      </w:pPr>
+      <w:r>
+        <w:t xml:space="preserve">4. Trạng thái</w:t>
+      </w:r>
+    </w:p>
+    <w:p>
+      <w:r>
+        <w:t xml:space="preserve">• </w:t>
+      </w:r>
+      <w:r>
+        <w:rPr>
+          <w:b/>
+          <w:bCs/>
+        </w:rPr>
+        <w:t xml:space="preserve">Kỳ gói (membership):</w:t>
+      </w:r>
+      <w:r>
+        <w:t xml:space="preserve"> </w:t>
+      </w:r>
+      <w:r>
+        <w:rPr>
+          <w:rFonts w:ascii="Consolas" w:hAnsi="Consolas"/>
+        </w:rPr>
+        <w:t xml:space="preserve">ACTIVE</w:t>
+      </w:r>
+      <w:r>
+        <w:t xml:space="preserve"> (đang chạy hoặc mua trước chờ tới lượt) → </w:t>
+      </w:r>
+      <w:r>
+        <w:rPr>
+          <w:rFonts w:ascii="Consolas" w:hAnsi="Consolas"/>
+        </w:rPr>
+        <w:t xml:space="preserve">FROZEN</w:t>
+      </w:r>
+      <w:r>
+        <w:t xml:space="preserve"> (đang bảo lưu) → </w:t>
+      </w:r>
+      <w:r>
+        <w:rPr>
+          <w:rFonts w:ascii="Consolas" w:hAnsi="Consolas"/>
+        </w:rPr>
+        <w:t xml:space="preserve">ACTIVE</w:t>
+      </w:r>
+      <w:r>
+        <w:t xml:space="preserve"> → </w:t>
+      </w:r>
+      <w:r>
+        <w:rPr>
+          <w:rFonts w:ascii="Consolas" w:hAnsi="Consolas"/>
+        </w:rPr>
+        <w:t xml:space="preserve">EXPIRED</w:t>
+      </w:r>
+      <w:r>
+        <w:t xml:space="preserve">; hoặc → </w:t>
+      </w:r>
+      <w:r>
+        <w:rPr>
+          <w:rFonts w:ascii="Consolas" w:hAnsi="Consolas"/>
+        </w:rPr>
+        <w:t xml:space="preserve">CANCELLED</w:t>
+      </w:r>
+      <w:r>
+        <w:t xml:space="preserve"> (hủy / đổi / hoàn hóa đơn).</w:t>
+      </w:r>
+    </w:p>
+    <w:p>
+      <w:r>
+        <w:t xml:space="preserve">• </w:t>
+      </w:r>
+      <w:r>
+        <w:rPr>
+          <w:b/>
+          <w:bCs/>
+        </w:rPr>
+        <w:t xml:space="preserve">Đăng ký lớp:</w:t>
+      </w:r>
+      <w:r>
+        <w:t xml:space="preserve"> </w:t>
+      </w:r>
+      <w:r>
+        <w:rPr>
+          <w:rFonts w:ascii="Consolas" w:hAnsi="Consolas"/>
+        </w:rPr>
+        <w:t xml:space="preserve">PENDING_PAYMENT</w:t>
+      </w:r>
+      <w:r>
+        <w:t xml:space="preserve"> (giữ chỗ chờ thanh toán) → </w:t>
+      </w:r>
+      <w:r>
+        <w:rPr>
+          <w:rFonts w:ascii="Consolas" w:hAnsi="Consolas"/>
+        </w:rPr>
+        <w:t xml:space="preserve">BOOKED</w:t>
+      </w:r>
+      <w:r>
+        <w:t xml:space="preserve"> → </w:t>
+      </w:r>
+      <w:r>
+        <w:rPr>
+          <w:rFonts w:ascii="Consolas" w:hAnsi="Consolas"/>
+        </w:rPr>
+        <w:t xml:space="preserve">CANCELLED</w:t>
+      </w:r>
+      <w:r>
+        <w:t xml:space="preserve">.</w:t>
+      </w:r>
+    </w:p>
+    <w:p>
+      <w:r>
+        <w:t xml:space="preserve">• </w:t>
+      </w:r>
+      <w:r>
+        <w:rPr>
+          <w:b/>
+          <w:bCs/>
+        </w:rPr>
+        <w:t xml:space="preserve">Điểm danh buổi:</w:t>
+      </w:r>
+      <w:r>
+        <w:t xml:space="preserve"> </w:t>
+      </w:r>
+      <w:r>
+        <w:rPr>
+          <w:rFonts w:ascii="Consolas" w:hAnsi="Consolas"/>
+        </w:rPr>
+        <w:t xml:space="preserve">PRESENT</w:t>
+      </w:r>
+      <w:r>
+        <w:t xml:space="preserve"> / </w:t>
+      </w:r>
+      <w:r>
+        <w:rPr>
+          <w:rFonts w:ascii="Consolas" w:hAnsi="Consolas"/>
+        </w:rPr>
+        <w:t xml:space="preserve">ABSENT</w:t>
+      </w:r>
+      <w:r>
+        <w:t xml:space="preserve"> / </w:t>
+      </w:r>
+      <w:r>
+        <w:rPr>
+          <w:rFonts w:ascii="Consolas" w:hAnsi="Consolas"/>
+        </w:rPr>
+        <w:t xml:space="preserve">EXCUSED</w:t>
+      </w:r>
+      <w:r>
+        <w:t xml:space="preserve"> (xin nghỉ trước hạn).</w:t>
+      </w:r>
+    </w:p>
+    <w:p>
+      <w:r>
+        <w:t xml:space="preserve">• </w:t>
+      </w:r>
+      <w:r>
+        <w:rPr>
+          <w:b/>
+          <w:bCs/>
+        </w:rPr>
+        <w:t xml:space="preserve">Lần hủy/đổi (purchase change):</w:t>
+      </w:r>
+      <w:r>
+        <w:t xml:space="preserve"> </w:t>
+      </w:r>
+      <w:r>
+        <w:rPr>
+          <w:rFonts w:ascii="Consolas" w:hAnsi="Consolas"/>
+        </w:rPr>
+        <w:t xml:space="preserve">PENDING_PAYMENT</w:t>
+      </w:r>
+      <w:r>
+        <w:t xml:space="preserve"> (chờ thu chênh lệch) → </w:t>
+      </w:r>
+      <w:r>
+        <w:rPr>
+          <w:rFonts w:ascii="Consolas" w:hAnsi="Consolas"/>
+        </w:rPr>
+        <w:t xml:space="preserve">DONE</w:t>
+      </w:r>
+      <w:r>
+        <w:t xml:space="preserve">; hoặc </w:t>
+      </w:r>
+      <w:r>
+        <w:rPr>
+          <w:rFonts w:ascii="Consolas" w:hAnsi="Consolas"/>
+        </w:rPr>
+        <w:t xml:space="preserve">CANCELLED</w:t>
+      </w:r>
+      <w:r>
+        <w:t xml:space="preserve"> khi hóa đơn chênh lệch hết hạn.</w:t>
+      </w:r>
+    </w:p>
+    <w:p>
+      <w:r>
+        <w:t xml:space="preserve">• </w:t>
+      </w:r>
+      <w:r>
+        <w:rPr>
+          <w:b/>
+          <w:bCs/>
+        </w:rPr>
+        <w:t xml:space="preserve">Hóa đơn:</w:t>
+      </w:r>
+      <w:r>
+        <w:t xml:space="preserve"> thêm loại </w:t>
+      </w:r>
+      <w:r>
+        <w:rPr>
+          <w:rFonts w:ascii="Consolas" w:hAnsi="Consolas"/>
+        </w:rPr>
+        <w:t xml:space="preserve">COURSE</w:t>
+      </w:r>
+      <w:r>
+        <w:t xml:space="preserve"> (khóa học) và </w:t>
+      </w:r>
+      <w:r>
+        <w:rPr>
+          <w:rFonts w:ascii="Consolas" w:hAnsi="Consolas"/>
+        </w:rPr>
+        <w:t xml:space="preserve">ADJUSTMENT</w:t>
+      </w:r>
+      <w:r>
+        <w:t xml:space="preserve"> (chênh lệch đổi); trạng thái như cũ.</w:t>
+      </w:r>
+    </w:p>
     <w:sectPr>
       <w:pgSz w:w="11906" w:h="16838" w:orient="portrait"/>
       <w:pgMar w:top="1440" w:right="1440" w:bottom="1440" w:left="1440" w:header="708" w:footer="708" w:gutter="0"/>

</xml_diff>

<commit_message>
docs(report): prepare final submission and reconcile sprint four ownership
</commit_message>
<xml_diff>
--- a/docs/yeu-cau/01_Use_Case_Tong_Hop.docx
+++ b/docs/yeu-cau/01_Use_Case_Tong_Hop.docx
@@ -2,6 +2,11 @@
 <file path=word/document.xml><?xml version="1.0" encoding="utf-8"?>
 <w:document xmlns:wpc="http://schemas.microsoft.com/office/word/2010/wordprocessingCanvas" xmlns:mc="http://schemas.openxmlformats.org/markup-compatibility/2006" xmlns:o="urn:schemas-microsoft-com:office:office" xmlns:r="http://schemas.openxmlformats.org/officeDocument/2006/relationships" xmlns:m="http://schemas.openxmlformats.org/officeDocument/2006/math" xmlns:v="urn:schemas-microsoft-com:vml" xmlns:wp14="http://schemas.microsoft.com/office/word/2010/wordprocessingDrawing" xmlns:wp="http://schemas.openxmlformats.org/drawingml/2006/wordprocessingDrawing" xmlns:w10="urn:schemas-microsoft-com:office:word" xmlns:w="http://schemas.openxmlformats.org/wordprocessingml/2006/main" xmlns:w14="http://schemas.microsoft.com/office/word/2010/wordml" xmlns:w15="http://schemas.microsoft.com/office/word/2012/wordml" xmlns:wpg="http://schemas.microsoft.com/office/word/2010/wordprocessingGroup" xmlns:wpi="http://schemas.microsoft.com/office/word/2010/wordprocessingInk" xmlns:wne="http://schemas.microsoft.com/office/word/2006/wordml" xmlns:wps="http://schemas.microsoft.com/office/word/2010/wordprocessingShape" xmlns:cx="http://schemas.microsoft.com/office/drawing/2014/chartex" xmlns:cx1="http://schemas.microsoft.com/office/drawing/2015/9/8/chartex" xmlns:cx2="http://schemas.microsoft.com/office/drawing/2015/10/21/chartex" xmlns:cx3="http://schemas.microsoft.com/office/drawing/2016/5/9/chartex" xmlns:cx4="http://schemas.microsoft.com/office/drawing/2016/5/10/chartex" xmlns:cx5="http://schemas.microsoft.com/office/drawing/2016/5/11/chartex" xmlns:cx6="http://schemas.microsoft.com/office/drawing/2016/5/12/chartex" xmlns:cx7="http://schemas.microsoft.com/office/drawing/2016/5/13/chartex" xmlns:cx8="http://schemas.microsoft.com/office/drawing/2016/5/14/chartex" xmlns:aink="http://schemas.microsoft.com/office/drawing/2016/ink" xmlns:am3d="http://schemas.microsoft.com/office/drawing/2017/model3d" xmlns:w16cex="http://schemas.microsoft.com/office/word/2018/wordml/cex" xmlns:w16cid="http://schemas.microsoft.com/office/word/2016/wordml/cid" xmlns:w16="http://schemas.microsoft.com/office/word/2018/wordml" xmlns:w16sdtdh="http://schemas.microsoft.com/office/word/2020/wordml/sdtdatahash" xmlns:w16se="http://schemas.microsoft.com/office/word/2015/wordml/symex" mc:Ignorable="w14 w15 wp14">
   <w:body>
+    <w:p>
+      <w:r>
+        <w:t>Phạm vi hiện hành 29/10/2026: không triển khai AI/kế hoạch tập luyện. Các UC tương ứng trong đặc tả gốc là phạm vi đã huỷ; phần đang triển khai gồm tài khoản, gói tự tập, lớp, thanh toán, hồ sơ, tổng kết, đánh giá và báo cáo. Sprint 4 chi tiết tại 08_Sprint4_UseCases_BusinessRules.docx. Bảo nhận toàn bộ task Sprint 4 trước đây giao Nhanh.</w:t>
+      </w:r>
+    </w:p>
     <w:p>
       <w:pPr>
         <w:pStyle w:val="Title"/>
@@ -2709,17 +2714,11 @@
           </w:tcPr>
           <w:p>
             <w:r>
-              <w:t xml:space="preserve">A1. Membership hiện tại còn hạn → thời hạn mới được nối tiếp từ ngày hết hạn hiện tại.</w:t>
-            </w:r>
-          </w:p>
-          <w:p>
-            <w:r>
-              <w:t xml:space="preserve">A2. Membership đã hết hạn → thời hạn mới bắt đầu tính từ ngày thanh toán thành công.</w:t>
-            </w:r>
-          </w:p>
-          <w:p>
-            <w:r>
-              <w:t xml:space="preserve">A3. Thanh toán thất bại → membership chưa được kích hoạt/gia hạn.</w:t>
+              <w:t>A1. Còn kỳ gói còn giá trị → tạo kỳ mới bắt đầu sau kỳ kết thúc muộn nhất; không cập nhật đè kỳ cũ.</w:t>
+              <w:br/>
+              <w:t>A2. Membership đã hết hạn → thời hạn mới bắt đầu tính từ ngày thanh toán thành công.</w:t>
+              <w:br/>
+              <w:t>A3. Thanh toán thất bại → membership chưa được kích hoạt/gia hạn.</w:t>
             </w:r>
           </w:p>
         </w:tc>
@@ -5793,7 +5792,7 @@
           </w:tcPr>
           <w:p>
             <w:r>
-              <w:t>Hội viên tạm dừng gói đang hiệu lực trong một khoảng ngày (đi công tác, ốm, nghỉ lễ). Trong thời gian bảo lưu không đăng ký lớp mới; khi kết thúc, ngày hết hạn được cộng thêm đúng số ngày đã dừng.</w:t>
+              <w:t>Hội viên tạm dừng gói đang hiệu lực trong một khoảng ngày (đi công tác, ốm, nghỉ lễ). Gói tự tập đang bảo lưu không chặn đăng ký lớp; điều kiện lớp được xét độc lập; khi kết thúc, ngày hết hạn được cộng thêm đúng số ngày đã dừng.</w:t>
             </w:r>
           </w:p>
         </w:tc>
@@ -14234,11 +14233,8 @@
           </w:tcPr>
           <w:p>
             <w:r>
-              <w:t>Hội viên có gói đang hiệu lực, không bảo lưu, không bị chặn đăng ký.</w:t>
-            </w:r>
-          </w:p>
-          <w:p>
-            <w:r>
+              <w:t>Hội viên ACTIVE, không bị chặn, không trùng lịch, đúng cửa sổ đăng ký và lớp còn sức chứa. Gói tự tập không phải điều kiện. Lớp thu phí dùng luồng mua khóa và giữ chỗ chờ thanh toán.</w:t>
+              <w:br/>
               <w:t>Lớp đang OPEN và đã đủ chỗ.</w:t>
             </w:r>
           </w:p>
@@ -15165,7 +15161,7 @@
           </w:tcPr>
           <w:p>
             <w:r>
-              <w:t>Lớp đầy: mời vào danh sách chờ (UC-CB-19). Gói hết hạn trước ngày kết thúc lớp: vẫn cho đăng ký nhưng cảnh báo số buổi sau ngày hết hạn và gợi ý gia hạn. Gói đang bảo lưu hoặc hội viên bị chặn: từ chối kèm ngày được đăng ký lại.</w:t>
+              <w:t>Lớp đầy mà đủ điều kiện khác: vào danh sách chờ (UC-CB-19). Tài khoản bị chặn hoặc trùng lịch: từ chối kèm lý do. Gói tự tập hết hạn/bảo lưu không chặn việc đăng ký lớp. Lớp có học phí chỉ BOOKED sau khi thanh toán đủ.</w:t>
             </w:r>
           </w:p>
         </w:tc>
@@ -17842,22 +17838,13 @@
           </w:tcPr>
           <w:p>
             <w:r>
-              <w:t xml:space="preserve">FE gọi GET /payments/{code}/status mỗi 3 giây (hằng số FE, không phải setting nghiệp vụ).</w:t>
-            </w:r>
-          </w:p>
-          <w:p>
-            <w:r>
-              <w:t xml:space="preserve">BE kiểm tra permission payment.read_own và hoá đơn thuộc về req.user (member khác ⇒ 404 để không lộ mã).</w:t>
-            </w:r>
-          </w:p>
-          <w:p>
-            <w:r>
-              <w:t xml:space="preserve">BE trả { status, amount, amountReceived, expiresAt, paidAt, membership? }.</w:t>
-            </w:r>
-          </w:p>
-          <w:p>
-            <w:r>
-              <w:t xml:space="preserve">FE hiển thị theo trạng thái: PENDING (đếm ngược), PAID (thành công + thông tin gói), FAILED (hết hạn / đã huỷ + nút tạo lại), UNDERPAID (đã nhận X, còn thiếu Y).</w:t>
+              <w:t>FE gọi GET /payments/{code}/status mỗi 3 giây (hằng số FE, không phải setting nghiệp vụ).</w:t>
+              <w:br/>
+              <w:t>BE kiểm tra permission payment.read_own và hoá đơn thuộc về req.user (member khác ⇒ 404 để không lộ mã).</w:t>
+              <w:br/>
+              <w:t>BE trả { status, amount, amountReceived, expiresAt, paidAt, membership? }.</w:t>
+              <w:br/>
+              <w:t>FE hiển thị theo trạng thái: PENDING (đếm ngược), PAID (thành công + thông tin gói), FAILED (hết hạn / đã huỷ + nút tạo lại), PENDING kèm kết quả UNDERPAID (đã nhận X, còn thiếu Y; UNDERPAID không phải enum InvoiceStatus).</w:t>
             </w:r>
           </w:p>
         </w:tc>
@@ -22807,11 +22794,8 @@
           </w:tcPr>
           <w:p>
             <w:r>
-              <w:t>A1. Hội viên muốn dùng khoản lặp để gia hạn: map khoản đó vào một hoá đơn gia hạn mới (UC-PAY-11), gói được cộng dồn theo BR-1.3.</w:t>
-            </w:r>
-          </w:p>
-          <w:p>
-            <w:r>
+              <w:t>A1. Hội viên muốn dùng khoản lặp để gia hạn: map khoản đó vào một hoá đơn gia hạn mới (UC-PAY-11), một kỳ gói mới được tạo nối tiếp theo BR-1.3.</w:t>
+              <w:br/>
               <w:t>A2. Chưa liên lạc được: phiếu ở WAITING_MEMBER, sau 24 giờ được nhắc lại trên dashboard.</w:t>
             </w:r>
           </w:p>

</xml_diff>